<commit_message>
Adopt v5.0.0 design direction: white substrate, no uppercase, two-tier buttons
Integrates a Claude Design handoff (white substrate replacing cream, sentence
case everywhere, filled+outline button system used site-wide including the
hero, and a new off-black #15130f as shared non-Agustos identity ink) as a
major version bump per the system's own semver policy for philosophy shifts.

Updates the canonical registry (tokens/design-tokens.json, web.css.tmpl,
brand/brands.json), regenerates every downstream artifact (adapter CSS,
WordPress theme.json, the UI kit, and all non-Agustos brand exports: logos,
favicons, social, office templates, guidelines and datasheet PDFs), and
documents the reasoning and the specific reversals in DESIGN.md and
MEMORY.md. Full test suite (71 tests) and both drift checks pass clean.

Co-Authored-By: Claude Sonnet 5 <noreply@anthropic.com>
</commit_message>
<xml_diff>
--- a/brand/exports/agustos/office/agustos-document-template.docx
+++ b/brand/exports/agustos/office/agustos-document-template.docx
@@ -25,7 +25,7 @@
       <w:r>
         <w:rPr>
           <w:rFonts w:ascii="Inter" w:hAnsi="Inter"/>
-          <w:color w:val="4A4A4A"/>
+          <w:color w:val="403B34"/>
         </w:rPr>
         <w:t>Subtitle, author, or date</w:t>
       </w:r>
@@ -219,7 +219,7 @@
     </w:pPr>
     <w:r>
       <w:rPr>
-        <w:color w:val="4A4A4A"/>
+        <w:color w:val="403B34"/>
         <w:sz w:val="17"/>
       </w:rPr>
       <w:t>Ağustos Teknoloji  ·  agustos.com</w:t>
@@ -670,7 +670,7 @@
     </w:pPr>
     <w:rPr>
       <w:rFonts w:ascii="Inter" w:hAnsi="Inter"/>
-      <w:color w:val="1A1A1A"/>
+      <w:color w:val="15130F"/>
       <w:sz w:val="22"/>
     </w:rPr>
   </w:style>
@@ -736,7 +736,7 @@
       <w:rFonts w:asciiTheme="majorHAnsi" w:eastAsiaTheme="majorEastAsia" w:hAnsiTheme="majorHAnsi" w:cstheme="majorBidi" w:ascii="Inter Tight" w:hAnsi="Inter Tight"/>
       <w:b/>
       <w:bCs/>
-      <w:color w:val="1A1A1A"/>
+      <w:color w:val="15130F"/>
       <w:sz w:val="40"/>
       <w:szCs w:val="28"/>
     </w:rPr>
@@ -760,7 +760,7 @@
       <w:rFonts w:asciiTheme="majorHAnsi" w:eastAsiaTheme="majorEastAsia" w:hAnsiTheme="majorHAnsi" w:cstheme="majorBidi" w:ascii="Inter Tight" w:hAnsi="Inter Tight"/>
       <w:b/>
       <w:bCs/>
-      <w:color w:val="1A1A1A"/>
+      <w:color w:val="15130F"/>
       <w:sz w:val="30"/>
       <w:szCs w:val="26"/>
     </w:rPr>
@@ -1023,7 +1023,7 @@
     <w:rPr>
       <w:rFonts w:asciiTheme="majorHAnsi" w:eastAsiaTheme="majorEastAsia" w:hAnsiTheme="majorHAnsi" w:cstheme="majorBidi" w:ascii="Inter Tight" w:hAnsi="Inter Tight"/>
       <w:b/>
-      <w:color w:val="1A1A1A"/>
+      <w:color w:val="15130F"/>
       <w:spacing w:val="5"/>
       <w:kern w:val="28"/>
       <w:sz w:val="56"/>

</xml_diff>

<commit_message>
Adopt v5.0.0 design direction: white substrate, no uppercase, two-tier buttons (#21)
Integrates a Claude Design handoff (white substrate replacing cream, sentence
case everywhere, filled+outline button system used site-wide including the
hero, and a new off-black #15130f as shared non-Agustos identity ink) as a
major version bump per the system's own semver policy for philosophy shifts.

Updates the canonical registry (tokens/design-tokens.json, web.css.tmpl,
brand/brands.json), regenerates every downstream artifact (adapter CSS,
WordPress theme.json, the UI kit, and all non-Agustos brand exports: logos,
favicons, social, office templates, guidelines and datasheet PDFs), and
documents the reasoning and the specific reversals in DESIGN.md and
MEMORY.md. Full test suite (71 tests) and both drift checks pass clean.

Co-authored-by: Claude Sonnet 5 <noreply@anthropic.com>
</commit_message>
<xml_diff>
--- a/brand/exports/agustos/office/agustos-document-template.docx
+++ b/brand/exports/agustos/office/agustos-document-template.docx
@@ -25,7 +25,7 @@
       <w:r>
         <w:rPr>
           <w:rFonts w:ascii="Inter" w:hAnsi="Inter"/>
-          <w:color w:val="4A4A4A"/>
+          <w:color w:val="403B34"/>
         </w:rPr>
         <w:t>Subtitle, author, or date</w:t>
       </w:r>
@@ -219,7 +219,7 @@
     </w:pPr>
     <w:r>
       <w:rPr>
-        <w:color w:val="4A4A4A"/>
+        <w:color w:val="403B34"/>
         <w:sz w:val="17"/>
       </w:rPr>
       <w:t>Ağustos Teknoloji  ·  agustos.com</w:t>
@@ -670,7 +670,7 @@
     </w:pPr>
     <w:rPr>
       <w:rFonts w:ascii="Inter" w:hAnsi="Inter"/>
-      <w:color w:val="1A1A1A"/>
+      <w:color w:val="15130F"/>
       <w:sz w:val="22"/>
     </w:rPr>
   </w:style>
@@ -736,7 +736,7 @@
       <w:rFonts w:asciiTheme="majorHAnsi" w:eastAsiaTheme="majorEastAsia" w:hAnsiTheme="majorHAnsi" w:cstheme="majorBidi" w:ascii="Inter Tight" w:hAnsi="Inter Tight"/>
       <w:b/>
       <w:bCs/>
-      <w:color w:val="1A1A1A"/>
+      <w:color w:val="15130F"/>
       <w:sz w:val="40"/>
       <w:szCs w:val="28"/>
     </w:rPr>
@@ -760,7 +760,7 @@
       <w:rFonts w:asciiTheme="majorHAnsi" w:eastAsiaTheme="majorEastAsia" w:hAnsiTheme="majorHAnsi" w:cstheme="majorBidi" w:ascii="Inter Tight" w:hAnsi="Inter Tight"/>
       <w:b/>
       <w:bCs/>
-      <w:color w:val="1A1A1A"/>
+      <w:color w:val="15130F"/>
       <w:sz w:val="30"/>
       <w:szCs w:val="26"/>
     </w:rPr>
@@ -1023,7 +1023,7 @@
     <w:rPr>
       <w:rFonts w:asciiTheme="majorHAnsi" w:eastAsiaTheme="majorEastAsia" w:hAnsiTheme="majorHAnsi" w:cstheme="majorBidi" w:ascii="Inter Tight" w:hAnsi="Inter Tight"/>
       <w:b/>
-      <w:color w:val="1A1A1A"/>
+      <w:color w:val="15130F"/>
       <w:spacing w:val="5"/>
       <w:kern w:val="28"/>
       <w:sz w:val="56"/>

</xml_diff>

<commit_message>
Apply the locked white-substrate palette and rationed red rules.
The approved handoff replaces cream paper with white, keeps cream for
callout bands, and limits red to 2px link, menu, and focus cues.

Co-authored-by: Cursor <cursoragent@cursor.com>
</commit_message>
<xml_diff>
--- a/brand/exports/agustos/office/agustos-document-template.docx
+++ b/brand/exports/agustos/office/agustos-document-template.docx
@@ -25,7 +25,7 @@
       <w:r>
         <w:rPr>
           <w:rFonts w:ascii="Inter" w:hAnsi="Inter"/>
-          <w:color w:val="4A4A4A"/>
+          <w:color w:val="403B34"/>
         </w:rPr>
         <w:t>Subtitle, author, or date</w:t>
       </w:r>
@@ -219,7 +219,7 @@
     </w:pPr>
     <w:r>
       <w:rPr>
-        <w:color w:val="4A4A4A"/>
+        <w:color w:val="403B34"/>
         <w:sz w:val="17"/>
       </w:rPr>
       <w:t>Ağustos Teknoloji  ·  agustos.com</w:t>
@@ -670,7 +670,7 @@
     </w:pPr>
     <w:rPr>
       <w:rFonts w:ascii="Inter" w:hAnsi="Inter"/>
-      <w:color w:val="1A1A1A"/>
+      <w:color w:val="15130F"/>
       <w:sz w:val="22"/>
     </w:rPr>
   </w:style>
@@ -736,7 +736,7 @@
       <w:rFonts w:asciiTheme="majorHAnsi" w:eastAsiaTheme="majorEastAsia" w:hAnsiTheme="majorHAnsi" w:cstheme="majorBidi" w:ascii="Inter Tight" w:hAnsi="Inter Tight"/>
       <w:b/>
       <w:bCs/>
-      <w:color w:val="1A1A1A"/>
+      <w:color w:val="15130F"/>
       <w:sz w:val="40"/>
       <w:szCs w:val="28"/>
     </w:rPr>
@@ -760,7 +760,7 @@
       <w:rFonts w:asciiTheme="majorHAnsi" w:eastAsiaTheme="majorEastAsia" w:hAnsiTheme="majorHAnsi" w:cstheme="majorBidi" w:ascii="Inter Tight" w:hAnsi="Inter Tight"/>
       <w:b/>
       <w:bCs/>
-      <w:color w:val="1A1A1A"/>
+      <w:color w:val="15130F"/>
       <w:sz w:val="30"/>
       <w:szCs w:val="26"/>
     </w:rPr>
@@ -1023,7 +1023,7 @@
     <w:rPr>
       <w:rFonts w:asciiTheme="majorHAnsi" w:eastAsiaTheme="majorEastAsia" w:hAnsiTheme="majorHAnsi" w:cstheme="majorBidi" w:ascii="Inter Tight" w:hAnsi="Inter Tight"/>
       <w:b/>
-      <w:color w:val="1A1A1A"/>
+      <w:color w:val="15130F"/>
       <w:spacing w:val="5"/>
       <w:kern w:val="28"/>
       <w:sz w:val="56"/>

</xml_diff>

<commit_message>
Lock the six-colour palette and dark theme for v5.0.0.
Replace the first white-substrate greys with #ebebeb and #404040, and flip the same six roles for dark instead of keeping the old invert.

Co-authored-by: Cursor <cursoragent@cursor.com>
</commit_message>
<xml_diff>
--- a/brand/exports/agustos/office/agustos-document-template.docx
+++ b/brand/exports/agustos/office/agustos-document-template.docx
@@ -25,7 +25,7 @@
       <w:r>
         <w:rPr>
           <w:rFonts w:ascii="Inter" w:hAnsi="Inter"/>
-          <w:color w:val="403B34"/>
+          <w:color w:val="404040"/>
         </w:rPr>
         <w:t>Subtitle, author, or date</w:t>
       </w:r>
@@ -219,7 +219,7 @@
     </w:pPr>
     <w:r>
       <w:rPr>
-        <w:color w:val="403B34"/>
+        <w:color w:val="404040"/>
         <w:sz w:val="17"/>
       </w:rPr>
       <w:t>Ağustos Teknoloji  ·  agustos.com</w:t>

</xml_diff>